<commit_message>
feat: add Senior Technical Lead promotion, PFM B2B rearchitecture, and InfoSec AI initiatives
</commit_message>
<xml_diff>
--- a/Aravind_Suresh_Resume_2026.docx
+++ b/Aravind_Suresh_Resume_2026.docx
@@ -29,14 +29,14 @@
           <w:sz w:val="21"/>
           <w:color w:val="374151"/>
         </w:rPr>
-        <w:t>Technical Lead Engineer | Scalable &amp; Reactive Systems</w:t>
+        <w:t>Senior Technical Lead Engineer | Scalable &amp; Reactive Systems</w:t>
       </w:r>
     </w:p>
     <!-- Contact Info Line -->
     <w:p>
       <w:pPr>
         <w:jc w:val="center"/>
-        <w:spacing w:after="140"/>
+        <w:spacing w:after="130"/>
       </w:pPr>
       <w:r>
         <w:rPr>
@@ -49,7 +49,7 @@
     <!-- SECTION: PROFESSIONAL SUMMARY -->
     <w:p>
       <w:pPr>
-        <w:spacing w:before="80" w:after="40"/>
+        <w:spacing w:before="70" w:after="35"/>
         <w:pBdr>
           <w:bottom w:val="single" w:sz="12" w:space="3" w:color="000000"/>
         </w:pBdr>
@@ -66,10 +66,19 @@
     <w:p>
       <w:pPr>
         <w:jc w:val="both"/>
-        <w:spacing w:after="80"/>
-      </w:pPr>
-      <w:r>
-        <w:t>Technical Lead Engineer with over 5+ years of engineering leadership architecting high-throughput distributed systems, reactive microservices, and financial infrastructure. Proven record scaling India's Account Aggregator (AA) framework to handle </w:t>
+        <w:spacing w:after="70"/>
+      </w:pPr>
+      <w:r>
+        <w:t>Senior Technical Lead Engineer with over 7+ years of engineering leadership architecting high-throughput distributed systems, reactive microservices, and enterprise financial platforms. Currently driving the </w:t>
+      </w:r>
+      <w:r>
+        <w:rPr>
+          <w:b/>
+        </w:rPr>
+        <w:t>PFM (Personal Finance Management) B2B Rearchitecture</w:t>
+      </w:r>
+      <w:r>
+        <w:t> across SaaS and On-Premises deployments for Tier-1 banks, scaling India's Account Aggregator framework to handle </w:t>
       </w:r>
       <w:r>
         <w:rPr>
@@ -78,13 +87,13 @@
         <w:t>over 1 Crore (10M+) daily transactions</w:t>
       </w:r>
       <w:r>
-        <w:t>, modernizing legacy banking integrations, and driving enterprise Generative AI initiatives.</w:t>
+        <w:t>, and automating InfoSec VAPT &amp; dependency scanning via Google ADK &amp; Claude slash commands (Harbor, Tenable, GitLab Ultimate).</w:t>
       </w:r>
     </w:p>
     <!-- SECTION: WORK EXPERIENCE -->
     <w:p>
       <w:pPr>
-        <w:spacing w:before="80" w:after="40"/>
+        <w:spacing w:before="70" w:after="35"/>
         <w:pBdr>
           <w:bottom w:val="single" w:sz="12" w:space="3" w:color="000000"/>
         </w:pBdr>
@@ -98,13 +107,13 @@
         <w:t>WORK EXPERIENCE</w:t>
       </w:r>
     </w:p>
-    <!-- Role 1: Tech Lead -->
-    <w:p>
-      <w:pPr>
-        <w:tabs>
-          <w:tab w:val="right" w:pos="10800"/>
-        </w:tabs>
-        <w:spacing w:before="40" w:after="10"/>
+    <!-- Company Header: Perfios Software Solutions -->
+    <w:p>
+      <w:pPr>
+        <w:tabs>
+          <w:tab w:val="right" w:pos="10800"/>
+        </w:tabs>
+        <w:spacing w:before="30" w:after="20"/>
       </w:pPr>
       <w:r>
         <w:rPr>
@@ -112,46 +121,166 @@
           <w:sz w:val="20"/>
           <w:color w:val="000000"/>
         </w:rPr>
-        <w:t>Technical Lead Engineer</w:t>
-      </w:r>
-      <w:r>
-        <w:tab/>
-        <w:rPr>
-          <w:b/>
-          <w:color w:val="374151"/>
-        </w:rPr>
-        <w:t>Apr 2024 – Present</w:t>
-      </w:r>
-    </w:p>
-    <w:p>
-      <w:pPr>
-        <w:tabs>
-          <w:tab w:val="right" w:pos="10800"/>
-        </w:tabs>
-        <w:spacing w:after="30"/>
-      </w:pPr>
-      <w:r>
+        <w:t>Perfios Software Solutions Pvt. Ltd.</w:t>
+      </w:r>
+      <w:r>
+        <w:tab/>
         <w:rPr>
           <w:i/>
           <w:color w:val="4B5563"/>
         </w:rPr>
-        <w:t>Perfios Software Solutions Pvt. Ltd.</w:t>
-      </w:r>
-      <w:r>
-        <w:tab/>
-        <w:rPr>
-          <w:color w:val="6B7280"/>
-        </w:rPr>
-        <w:t>Bangalore, India</w:t>
+        <w:t>Bangalore, India • Jul 2019 – Present</w:t>
+      </w:r>
+    </w:p>
+    <!-- Role 1: Senior Tech Lead -->
+    <w:p>
+      <w:pPr>
+        <w:tabs>
+          <w:tab w:val="right" w:pos="10800"/>
+        </w:tabs>
+        <w:spacing w:before="20" w:after="10"/>
+      </w:pPr>
+      <w:r>
+        <w:rPr>
+          <w:b/>
+          <w:sz w:val="19"/>
+          <w:color w:val="000000"/>
+        </w:rPr>
+        <w:t>Senior Technical Lead Engineer</w:t>
+      </w:r>
+      <w:r>
+        <w:tab/>
+        <w:rPr>
+          <w:b/>
+          <w:color w:val="374151"/>
+        </w:rPr>
+        <w:t>Apr 2026 – Present</w:t>
       </w:r>
     </w:p>
     <w:p>
       <w:pPr>
         <w:ind w:left="280"/>
-        <w:spacing w:after="20"/>
+        <w:spacing w:after="15"/>
         <w:jc w:val="both"/>
       </w:pPr>
       <w:r>
+        <w:t>• Leading the </w:t>
+      </w:r>
+      <w:r>
+        <w:rPr>
+          <w:b/>
+        </w:rPr>
+        <w:t>PFM (Personal Finance Management) B2B Rearchitecture</w:t>
+      </w:r>
+      <w:r>
+        <w:t> across both </w:t>
+      </w:r>
+      <w:r>
+        <w:rPr>
+          <w:b/>
+        </w:rPr>
+        <w:t>multi-tenant SaaS</w:t>
+      </w:r>
+      <w:r>
+        <w:t> and enterprise </w:t>
+      </w:r>
+      <w:r>
+        <w:rPr>
+          <w:b/>
+        </w:rPr>
+        <w:t>On-Premises</w:t>
+      </w:r>
+      <w:r>
+        <w:t> banking deployments, decoupling legacy modules into modular, high-availability microservices.</w:t>
+      </w:r>
+    </w:p>
+    <w:p>
+      <w:pPr>
+        <w:ind w:left="280"/>
+        <w:spacing w:after="45"/>
+        <w:jc w:val="both"/>
+      </w:pPr>
+      <w:r>
+        <w:t>• Automated </w:t>
+      </w:r>
+      <w:r>
+        <w:rPr>
+          <w:b/>
+        </w:rPr>
+        <w:t>InfoSec VAPT &amp; dependency scanning</w:t>
+      </w:r>
+      <w:r>
+        <w:t> via </w:t>
+      </w:r>
+      <w:r>
+        <w:rPr>
+          <w:b/>
+        </w:rPr>
+        <w:t>Google ADK</w:t>
+      </w:r>
+      <w:r>
+        <w:t> and custom </w:t>
+      </w:r>
+      <w:r>
+        <w:rPr>
+          <w:b/>
+        </w:rPr>
+        <w:t>Claude slash commands</w:t>
+      </w:r>
+      <w:r>
+        <w:t> integrated with </w:t>
+      </w:r>
+      <w:r>
+        <w:rPr>
+          <w:b/>
+        </w:rPr>
+        <w:t>Harbor &amp; Tenable APIs</w:t>
+      </w:r>
+      <w:r>
+        <w:t>; led automated </w:t>
+      </w:r>
+      <w:r>
+        <w:rPr>
+          <w:b/>
+        </w:rPr>
+        <w:t>GitLab Ultimate VAPT remediation</w:t>
+      </w:r>
+      <w:r>
+        <w:t> and security fixes.</w:t>
+      </w:r>
+    </w:p>
+    <!-- Role 2: Tech Lead -->
+    <w:p>
+      <w:pPr>
+        <w:tabs>
+          <w:tab w:val="right" w:pos="10800"/>
+        </w:tabs>
+        <w:spacing w:before="20" w:after="10"/>
+      </w:pPr>
+      <w:r>
+        <w:rPr>
+          <w:b/>
+          <w:sz w:val="19"/>
+          <w:color w:val="000000"/>
+        </w:rPr>
+        <w:t>Technical Lead Engineer</w:t>
+      </w:r>
+      <w:r>
+        <w:tab/>
+        <w:rPr>
+          <w:b/>
+          <w:color w:val="374151"/>
+        </w:rPr>
+        <w:t>Apr 2024 – Mar 2026</w:t>
+      </w:r>
+    </w:p>
+    <w:p>
+      <w:pPr>
+        <w:ind w:left="280"/>
+        <w:spacing w:after="15"/>
+        <w:jc w:val="both"/>
+      </w:pPr>
+      <w:r>
         <w:t>• Engineered the scaling of Perfios Account Aggregator (AA) framework microservices using </w:t>
       </w:r>
       <w:r>
@@ -176,11 +305,11 @@
     <w:p>
       <w:pPr>
         <w:ind w:left="280"/>
-        <w:spacing w:after="60"/>
+        <w:spacing w:after="45"/>
         <w:jc w:val="both"/>
       </w:pPr>
       <w:r>
-        <w:t>• Spearheaded architectural modernization of core AA microservices into resilient microservices containerized on </w:t>
+        <w:t>• Spearheaded architectural modernization of core AA microservices on </w:t>
       </w:r>
       <w:r>
         <w:rPr>
@@ -201,18 +330,18 @@
         <w:t> evaluating LLM feasibility for financial automation.</w:t>
       </w:r>
     </w:p>
-    <!-- Role 2: Principal SDE -->
-    <w:p>
-      <w:pPr>
-        <w:tabs>
-          <w:tab w:val="right" w:pos="10800"/>
-        </w:tabs>
-        <w:spacing w:before="30" w:after="10"/>
-      </w:pPr>
-      <w:r>
-        <w:rPr>
-          <w:b/>
-          <w:sz w:val="20"/>
+    <!-- Role 3: Principal SDE -->
+    <w:p>
+      <w:pPr>
+        <w:tabs>
+          <w:tab w:val="right" w:pos="10800"/>
+        </w:tabs>
+        <w:spacing w:before="20" w:after="10"/>
+      </w:pPr>
+      <w:r>
+        <w:rPr>
+          <w:b/>
+          <w:sz w:val="19"/>
           <w:color w:val="000000"/>
         </w:rPr>
         <w:t>Principal Software Development Engineer</w:t>
@@ -228,30 +357,8 @@
     </w:p>
     <w:p>
       <w:pPr>
-        <w:tabs>
-          <w:tab w:val="right" w:pos="10800"/>
-        </w:tabs>
-        <w:spacing w:after="30"/>
-      </w:pPr>
-      <w:r>
-        <w:rPr>
-          <w:i/>
-          <w:color w:val="4B5563"/>
-        </w:rPr>
-        <w:t>Perfios Software Solutions Pvt. Ltd.</w:t>
-      </w:r>
-      <w:r>
-        <w:tab/>
-        <w:rPr>
-          <w:color w:val="6B7280"/>
-        </w:rPr>
-        <w:t>Bangalore, India</w:t>
-      </w:r>
-    </w:p>
-    <w:p>
-      <w:pPr>
         <w:ind w:left="280"/>
-        <w:spacing w:after="20"/>
+        <w:spacing w:after="45"/>
         <w:jc w:val="both"/>
       </w:pPr>
       <w:r>
@@ -264,93 +371,51 @@
         <w:t>API Orchestration Layer</w:t>
       </w:r>
       <w:r>
-        <w:t> standardizing external banking service invocations, promoting code reusability and reducing institutional integration turnaround by several weeks.</w:t>
+        <w:t> standardizing external banking service invocations, cutting institutional integration turnaround by several weeks; owned end-to-end SDLC of the </w:t>
+      </w:r>
+      <w:r>
+        <w:rPr>
+          <w:b/>
+        </w:rPr>
+        <w:t>Financial Information Provider (FIP) module</w:t>
+      </w:r>
+      <w:r>
+        <w:t>.</w:t>
+      </w:r>
+    </w:p>
+    <!-- Role 4: Senior SDE & Developer -->
+    <w:p>
+      <w:pPr>
+        <w:tabs>
+          <w:tab w:val="right" w:pos="10800"/>
+        </w:tabs>
+        <w:spacing w:before="20" w:after="10"/>
+      </w:pPr>
+      <w:r>
+        <w:rPr>
+          <w:b/>
+          <w:sz w:val="19"/>
+          <w:color w:val="000000"/>
+        </w:rPr>
+        <w:t>Senior Software Engineer &amp; Software Developer</w:t>
+      </w:r>
+      <w:r>
+        <w:tab/>
+        <w:rPr>
+          <w:b/>
+          <w:color w:val="374151"/>
+        </w:rPr>
+        <w:t>Jul 2019 – Jun 2023</w:t>
       </w:r>
     </w:p>
     <w:p>
       <w:pPr>
         <w:ind w:left="280"/>
-        <w:spacing w:after="60"/>
+        <w:spacing w:after="70"/>
         <w:jc w:val="both"/>
       </w:pPr>
       <w:r>
-        <w:t>• Owned end-to-end SDLC of the </w:t>
-      </w:r>
-      <w:r>
-        <w:rPr>
-          <w:b/>
-        </w:rPr>
-        <w:t>Financial Information Provider (FIP) module</w:t>
-      </w:r>
-      <w:r>
-        <w:t> from whiteboard design to a production-grade system handling millions of daily customer requests across the ecosystem.</w:t>
-      </w:r>
-    </w:p>
-    <!-- Role 3: Senior & SDE -->
-    <w:p>
-      <w:pPr>
-        <w:tabs>
-          <w:tab w:val="right" w:pos="10800"/>
-        </w:tabs>
-        <w:spacing w:before="30" w:after="10"/>
-      </w:pPr>
-      <w:r>
-        <w:rPr>
-          <w:b/>
-          <w:sz w:val="20"/>
-          <w:color w:val="000000"/>
-        </w:rPr>
-        <w:t>Senior Software Engineer &amp; Software Developer</w:t>
-      </w:r>
-      <w:r>
-        <w:tab/>
-        <w:rPr>
-          <w:b/>
-          <w:color w:val="374151"/>
-        </w:rPr>
-        <w:t>Jul 2019 – Jun 2023</w:t>
-      </w:r>
-    </w:p>
-    <w:p>
-      <w:pPr>
-        <w:tabs>
-          <w:tab w:val="right" w:pos="10800"/>
-        </w:tabs>
-        <w:spacing w:after="30"/>
-      </w:pPr>
-      <w:r>
-        <w:rPr>
-          <w:i/>
-          <w:color w:val="4B5563"/>
-        </w:rPr>
-        <w:t>Perfios Software Solutions Pvt. Ltd.</w:t>
-      </w:r>
-      <w:r>
-        <w:tab/>
-        <w:rPr>
-          <w:color w:val="6B7280"/>
-        </w:rPr>
-        <w:t>Bangalore, India</w:t>
-      </w:r>
-    </w:p>
-    <w:p>
-      <w:pPr>
-        <w:ind w:left="280"/>
-        <w:spacing w:after="20"/>
-        <w:jc w:val="both"/>
-      </w:pPr>
-      <w:r>
-        <w:t>• Led technical onboarding for marquee Tier-1 Private and Public sector banks to the Account Aggregator platform, guiding institutional stakeholders from sandbox testing to production rollout.</w:t>
-      </w:r>
-    </w:p>
-    <w:p>
-      <w:pPr>
-        <w:ind w:left="280"/>
-        <w:spacing w:after="80"/>
-        <w:jc w:val="both"/>
-      </w:pPr>
-      <w:r>
-        <w:t>• Developed a high-throughput real-time data streaming service using </w:t>
+        <w:t>• Led technical onboarding for marquee Tier-1 Private and Public sector banks to the AA platform; built a real-time data streaming service with </w:t>
       </w:r>
       <w:r>
         <w:rPr>
@@ -359,7 +424,7 @@
         <w:t>Apache Kafka</w:t>
       </w:r>
       <w:r>
-        <w:t>; built the Perfios-AA Admin Dashboard with </w:t>
+        <w:t> and the Perfios-AA Admin Dashboard with </w:t>
       </w:r>
       <w:r>
         <w:rPr>
@@ -368,22 +433,13 @@
         <w:t>Spring Boot &amp; React JS</w:t>
       </w:r>
       <w:r>
-        <w:t> with automated </w:t>
-      </w:r>
-      <w:r>
-        <w:rPr>
-          <w:b/>
-        </w:rPr>
-        <w:t>GitLab CI/CD &amp; Docker</w:t>
-      </w:r>
-      <w:r>
         <w:t>.</w:t>
       </w:r>
     </w:p>
     <!-- SECTION: TECHNICAL SKILLS -->
     <w:p>
       <w:pPr>
-        <w:spacing w:before="80" w:after="40"/>
+        <w:spacing w:before="70" w:after="35"/>
         <w:pBdr>
           <w:bottom w:val="single" w:sz="12" w:space="3" w:color="000000"/>
         </w:pBdr>
@@ -399,7 +455,7 @@
     </w:p>
     <w:p>
       <w:pPr>
-        <w:spacing w:after="20"/>
+        <w:spacing w:after="15"/>
       </w:pPr>
       <w:r>
         <w:rPr>
@@ -415,56 +471,56 @@
     </w:p>
     <w:p>
       <w:pPr>
-        <w:spacing w:after="20"/>
-      </w:pPr>
-      <w:r>
-        <w:rPr>
-          <w:b/>
-          <w:color w:val="000000"/>
-        </w:rPr>
-        <w:t>Streaming &amp; Cloud: </w:t>
+        <w:spacing w:after="15"/>
+      </w:pPr>
+      <w:r>
+        <w:rPr>
+          <w:b/>
+          <w:color w:val="000000"/>
+        </w:rPr>
+        <w:t>Architecture &amp; Cloud: </w:t>
       </w:r>
       <w:r>
         <w:color w:val="374151"/>
-        <w:t>Apache Kafka, Amazon Web Services (AWS), Docker, Kubernetes, CI/CD (GitLab, GitHub Actions)</w:t>
-      </w:r>
-    </w:p>
-    <w:p>
-      <w:pPr>
-        <w:spacing w:after="20"/>
-      </w:pPr>
-      <w:r>
-        <w:rPr>
-          <w:b/>
-          <w:color w:val="000000"/>
-        </w:rPr>
-        <w:t>AI &amp; Languages: </w:t>
+        <w:t>Multi-Tenant SaaS, On-Premises Banking Deployments, Amazon Web Services (AWS), Docker, Kubernetes, CI/CD</w:t>
+      </w:r>
+    </w:p>
+    <w:p>
+      <w:pPr>
+        <w:spacing w:after="15"/>
+      </w:pPr>
+      <w:r>
+        <w:rPr>
+          <w:b/>
+          <w:color w:val="000000"/>
+        </w:rPr>
+        <w:t>AI, Security &amp; Tools: </w:t>
       </w:r>
       <w:r>
         <w:color w:val="374151"/>
-        <w:t>Python 3, Generative AI (LLMs, Prompt Engineering), JavaScript, TypeScript, React JS, Material UI</w:t>
-      </w:r>
-    </w:p>
-    <w:p>
-      <w:pPr>
-        <w:spacing w:after="80"/>
-      </w:pPr>
-      <w:r>
-        <w:rPr>
-          <w:b/>
-          <w:color w:val="000000"/>
-        </w:rPr>
-        <w:t>Databases &amp; Storage: </w:t>
+        <w:t>Claude Code (Slash Commands), Google ADK (Agent Dev Kit), Harbor &amp; Tenable APIs, GitLab Ultimate VAPT, InfoSec AI</w:t>
+      </w:r>
+    </w:p>
+    <w:p>
+      <w:pPr>
+        <w:spacing w:after="70"/>
+      </w:pPr>
+      <w:r>
+        <w:rPr>
+          <w:b/>
+          <w:color w:val="000000"/>
+        </w:rPr>
+        <w:t>Databases &amp; UI: </w:t>
       </w:r>
       <w:r>
         <w:color w:val="374151"/>
-        <w:t>MongoDB, MySQL, Oracle DB, Redis Caching, Query Plan Optimization</w:t>
+        <w:t>MongoDB, MySQL, Oracle DB, Redis Caching, Query Plan Optimization, React JS, Material UI</w:t>
       </w:r>
     </w:p>
     <!-- SECTION: HONORS & PUBLICATIONS -->
     <w:p>
       <w:pPr>
-        <w:spacing w:before="80" w:after="40"/>
+        <w:spacing w:before="70" w:after="35"/>
         <w:pBdr>
           <w:bottom w:val="single" w:sz="12" w:space="3" w:color="000000"/>
         </w:pBdr>
@@ -483,7 +539,7 @@
         <w:tabs>
           <w:tab w:val="right" w:pos="10800"/>
         </w:tabs>
-        <w:spacing w:after="20"/>
+        <w:spacing w:after="15"/>
       </w:pPr>
       <w:r>
         <w:rPr>
@@ -507,7 +563,7 @@
         <w:tabs>
           <w:tab w:val="right" w:pos="10800"/>
         </w:tabs>
-        <w:spacing w:after="20"/>
+        <w:spacing w:after="15"/>
       </w:pPr>
       <w:r>
         <w:rPr>
@@ -531,7 +587,7 @@
         <w:tabs>
           <w:tab w:val="right" w:pos="10800"/>
         </w:tabs>
-        <w:spacing w:after="80"/>
+        <w:spacing w:after="70"/>
       </w:pPr>
       <w:r>
         <w:rPr>
@@ -553,7 +609,7 @@
     <!-- SECTION: EDUCATION & CERTIFICATIONS -->
     <w:p>
       <w:pPr>
-        <w:spacing w:before="80" w:after="40"/>
+        <w:spacing w:before="70" w:after="35"/>
         <w:pBdr>
           <w:bottom w:val="single" w:sz="12" w:space="3" w:color="000000"/>
         </w:pBdr>
@@ -572,7 +628,7 @@
         <w:tabs>
           <w:tab w:val="right" w:pos="10800"/>
         </w:tabs>
-        <w:spacing w:after="20"/>
+        <w:spacing w:after="15"/>
       </w:pPr>
       <w:r>
         <w:rPr>
@@ -605,7 +661,7 @@
         <w:tabs>
           <w:tab w:val="right" w:pos="10800"/>
         </w:tabs>
-        <w:spacing w:after="20"/>
+        <w:spacing w:after="15"/>
       </w:pPr>
       <w:r>
         <w:rPr>
@@ -624,10 +680,10 @@
         <w:t>Apr 2024</w:t>
       </w:r>
     </w:p>
-    <!-- Page formatting / Margins (0.5 in margins) -->
+    <!-- Page formatting / Margins (0.47 in margins) -->
     <w:sectPr>
       <w:pgSz w:w="12240" w:h="15840"/>
-      <w:pgMar w:top="720" w:right="720" w:bottom="720" w:left="720" w:header="0" w:footer="0" w:gutter="0"/>
+      <w:pgMar w:top="680" w:right="720" w:bottom="680" w:left="720" w:header="0" w:footer="0" w:gutter="0"/>
     </w:sectPr>
   </w:body>
 </w:document>

</xml_diff>